<commit_message>
Custom home rep fee: 5% of hard costs, pre-con included (matches Stonehouse)
Co-Authored-By: Claude Fable 5.1 <noreply@anthropic.com>
Claude-Session: https://claude.ai/code/session_01CcVK4VHgsRENhRDHbiRR2B
</commit_message>
<xml_diff>
--- a/assets/customrep-files/Victory Formation-Engagement-Letter.docx
+++ b/assets/customrep-files/Victory Formation-Engagement-Letter.docx
@@ -84,12 +84,7 @@
     </w:p>
     <w:p>
       <w:r>
-        <w:t>Pre-construction fee: in consideration of the pre-construction services in Section 2, the Client shall pay VFV a flat fee of $7,500, due on execution of this Agreement.</w:t>
-      </w:r>
-    </w:p>
-    <w:p>
-      <w:r>
-        <w:t>Owner's Rep fee: in consideration of the construction-phase services in Section 2, the Client shall pay VFV a fee equal to three percent (3%) of the Hard Build Cost, subject to a minimum of $25,000 (the "Owner's Rep Fee").</w:t>
+        <w:t>Fee structure: in consideration of the services described in Section 2, including pre-construction services, the Client shall pay VFV an Owner's Rep fee equal to five percent (5%) of the Hard Build Cost (the "Owner's Rep Fee"). No separate pre-construction fee applies.</w:t>
       </w:r>
     </w:p>
     <w:p>

</xml_diff>